<commit_message>
Worked on writing clean code rules, URL vs URI in rest api basics and deep link docs, gonna work on ai doc for adding AGENTS.md
</commit_message>
<xml_diff>
--- a/programming_mental_models/p5_ai_usage_and_mental_models.docx
+++ b/programming_mental_models/p5_ai_usage_and_mental_models.docx
@@ -22,12 +22,56 @@
     </w:p>
     <w:p>
       <w:pPr>
-        <w:jc w:val="both"/>
-        <w:rPr>
-          <w:sz w:val="32"/>
-          <w:szCs w:val="32"/>
-        </w:rPr>
-      </w:pPr>
+        <w:pStyle w:val="ListParagraph"/>
+        <w:numPr>
+          <w:ilvl w:val="0"/>
+          <w:numId w:val="1"/>
+        </w:numPr>
+        <w:jc w:val="both"/>
+        <w:rPr>
+          <w:sz w:val="32"/>
+          <w:szCs w:val="32"/>
+        </w:rPr>
+      </w:pPr>
+      <w:r>
+        <w:rPr>
+          <w:b/>
+          <w:bCs/>
+          <w:sz w:val="32"/>
+          <w:szCs w:val="32"/>
+        </w:rPr>
+        <w:t>MCP</w:t>
+      </w:r>
+      <w:r>
+        <w:rPr>
+          <w:sz w:val="32"/>
+          <w:szCs w:val="32"/>
+        </w:rPr>
+        <w:t xml:space="preserve"> (Model Context </w:t>
+      </w:r>
+      <w:proofErr w:type="gramStart"/>
+      <w:r>
+        <w:rPr>
+          <w:sz w:val="32"/>
+          <w:szCs w:val="32"/>
+        </w:rPr>
+        <w:t>Protocol)</w:t>
+      </w:r>
+      <w:r>
+        <w:rPr>
+          <w:sz w:val="32"/>
+          <w:szCs w:val="32"/>
+        </w:rPr>
+        <w:t>…</w:t>
+      </w:r>
+      <w:proofErr w:type="gramEnd"/>
+      <w:r>
+        <w:rPr>
+          <w:sz w:val="32"/>
+          <w:szCs w:val="32"/>
+        </w:rPr>
+        <w:t>………………………………………2</w:t>
+      </w:r>
     </w:p>
     <w:p>
       <w:pPr>
@@ -89,58 +133,631 @@
           <w:szCs w:val="32"/>
         </w:rPr>
         <w:lastRenderedPageBreak/>
-        <w:t>AI Code Review:</w:t>
-      </w:r>
-    </w:p>
-    <w:p>
-      <w:pPr>
-        <w:jc w:val="both"/>
-        <w:rPr>
-          <w:sz w:val="32"/>
-          <w:szCs w:val="32"/>
-        </w:rPr>
-      </w:pPr>
-      <w:r>
-        <w:rPr>
-          <w:sz w:val="32"/>
-          <w:szCs w:val="32"/>
-        </w:rPr>
-        <w:t xml:space="preserve"># Use Code-Rabbit and </w:t>
-      </w:r>
-      <w:r>
-        <w:rPr>
-          <w:b/>
-          <w:bCs/>
-          <w:sz w:val="32"/>
-          <w:szCs w:val="32"/>
-        </w:rPr>
-        <w:t>GitHub</w:t>
-      </w:r>
-      <w:r>
-        <w:rPr>
-          <w:sz w:val="32"/>
-          <w:szCs w:val="32"/>
-        </w:rPr>
-        <w:t xml:space="preserve"> Actions so when we open a PR Code-Rabbit automatically reviews our code looks for logic errors, architectural mistakes and potential bugs</w:t>
-      </w:r>
-    </w:p>
-    <w:p>
-      <w:pPr>
-        <w:jc w:val="both"/>
-        <w:rPr>
-          <w:sz w:val="32"/>
-          <w:szCs w:val="32"/>
-        </w:rPr>
-      </w:pPr>
-    </w:p>
-    <w:p>
-      <w:pPr>
-        <w:jc w:val="both"/>
-        <w:rPr>
-          <w:sz w:val="32"/>
-          <w:szCs w:val="32"/>
-        </w:rPr>
-      </w:pPr>
+        <w:t>MCP (Model Context Protocol):</w:t>
+      </w:r>
+    </w:p>
+    <w:p>
+      <w:pPr>
+        <w:jc w:val="both"/>
+        <w:rPr>
+          <w:sz w:val="32"/>
+          <w:szCs w:val="32"/>
+        </w:rPr>
+      </w:pPr>
+      <w:r>
+        <w:rPr>
+          <w:sz w:val="32"/>
+          <w:szCs w:val="32"/>
+        </w:rPr>
+        <w:t xml:space="preserve"># </w:t>
+      </w:r>
+      <w:r>
+        <w:rPr>
+          <w:sz w:val="32"/>
+          <w:szCs w:val="32"/>
+        </w:rPr>
+        <w:t>Think of MCP (Model Context Protocol) as USB-C for AI. Before MCP:</w:t>
+      </w:r>
+    </w:p>
+    <w:p>
+      <w:pPr>
+        <w:jc w:val="both"/>
+        <w:rPr>
+          <w:b/>
+          <w:bCs/>
+          <w:sz w:val="28"/>
+          <w:szCs w:val="28"/>
+        </w:rPr>
+      </w:pPr>
+      <w:r>
+        <w:rPr>
+          <w:b/>
+          <w:bCs/>
+          <w:sz w:val="28"/>
+          <w:szCs w:val="28"/>
+        </w:rPr>
+        <w:t>Codex</w:t>
+      </w:r>
+    </w:p>
+    <w:p>
+      <w:pPr>
+        <w:jc w:val="both"/>
+        <w:rPr>
+          <w:b/>
+          <w:bCs/>
+          <w:sz w:val="28"/>
+          <w:szCs w:val="28"/>
+        </w:rPr>
+      </w:pPr>
+      <w:r>
+        <w:rPr>
+          <w:b/>
+          <w:bCs/>
+          <w:sz w:val="28"/>
+          <w:szCs w:val="28"/>
+        </w:rPr>
+        <w:t xml:space="preserve">   │</w:t>
+      </w:r>
+    </w:p>
+    <w:p>
+      <w:pPr>
+        <w:jc w:val="both"/>
+        <w:rPr>
+          <w:b/>
+          <w:bCs/>
+          <w:sz w:val="28"/>
+          <w:szCs w:val="28"/>
+        </w:rPr>
+      </w:pPr>
+      <w:r>
+        <w:rPr>
+          <w:b/>
+          <w:bCs/>
+          <w:sz w:val="28"/>
+          <w:szCs w:val="28"/>
+        </w:rPr>
+        <w:t xml:space="preserve">   </w:t>
+      </w:r>
+      <w:r>
+        <w:rPr>
+          <w:rFonts w:ascii="Arial" w:hAnsi="Arial" w:cs="Arial"/>
+          <w:b/>
+          <w:bCs/>
+          <w:sz w:val="28"/>
+          <w:szCs w:val="28"/>
+        </w:rPr>
+        <w:t>├</w:t>
+      </w:r>
+      <w:r>
+        <w:rPr>
+          <w:rFonts w:ascii="Aptos" w:hAnsi="Aptos" w:cs="Aptos"/>
+          <w:b/>
+          <w:bCs/>
+          <w:sz w:val="28"/>
+          <w:szCs w:val="28"/>
+        </w:rPr>
+        <w:t>──</w:t>
+      </w:r>
+      <w:r>
+        <w:rPr>
+          <w:b/>
+          <w:bCs/>
+          <w:sz w:val="28"/>
+          <w:szCs w:val="28"/>
+        </w:rPr>
+        <w:t xml:space="preserve"> Doesn't know Flutter</w:t>
+      </w:r>
+    </w:p>
+    <w:p>
+      <w:pPr>
+        <w:jc w:val="both"/>
+        <w:rPr>
+          <w:b/>
+          <w:bCs/>
+          <w:sz w:val="28"/>
+          <w:szCs w:val="28"/>
+        </w:rPr>
+      </w:pPr>
+      <w:r>
+        <w:rPr>
+          <w:b/>
+          <w:bCs/>
+          <w:sz w:val="28"/>
+          <w:szCs w:val="28"/>
+        </w:rPr>
+        <w:t xml:space="preserve">   </w:t>
+      </w:r>
+      <w:r>
+        <w:rPr>
+          <w:rFonts w:ascii="Arial" w:hAnsi="Arial" w:cs="Arial"/>
+          <w:b/>
+          <w:bCs/>
+          <w:sz w:val="28"/>
+          <w:szCs w:val="28"/>
+        </w:rPr>
+        <w:t>├</w:t>
+      </w:r>
+      <w:r>
+        <w:rPr>
+          <w:rFonts w:ascii="Aptos" w:hAnsi="Aptos" w:cs="Aptos"/>
+          <w:b/>
+          <w:bCs/>
+          <w:sz w:val="28"/>
+          <w:szCs w:val="28"/>
+        </w:rPr>
+        <w:t>──</w:t>
+      </w:r>
+      <w:r>
+        <w:rPr>
+          <w:b/>
+          <w:bCs/>
+          <w:sz w:val="28"/>
+          <w:szCs w:val="28"/>
+        </w:rPr>
+        <w:t xml:space="preserve"> Doesn't know Firebase</w:t>
+      </w:r>
+    </w:p>
+    <w:p>
+      <w:pPr>
+        <w:jc w:val="both"/>
+        <w:rPr>
+          <w:b/>
+          <w:bCs/>
+          <w:sz w:val="28"/>
+          <w:szCs w:val="28"/>
+        </w:rPr>
+      </w:pPr>
+      <w:r>
+        <w:rPr>
+          <w:b/>
+          <w:bCs/>
+          <w:sz w:val="28"/>
+          <w:szCs w:val="28"/>
+        </w:rPr>
+        <w:t xml:space="preserve">   </w:t>
+      </w:r>
+      <w:r>
+        <w:rPr>
+          <w:rFonts w:ascii="Arial" w:hAnsi="Arial" w:cs="Arial"/>
+          <w:b/>
+          <w:bCs/>
+          <w:sz w:val="28"/>
+          <w:szCs w:val="28"/>
+        </w:rPr>
+        <w:t>├</w:t>
+      </w:r>
+      <w:r>
+        <w:rPr>
+          <w:rFonts w:ascii="Aptos" w:hAnsi="Aptos" w:cs="Aptos"/>
+          <w:b/>
+          <w:bCs/>
+          <w:sz w:val="28"/>
+          <w:szCs w:val="28"/>
+        </w:rPr>
+        <w:t>──</w:t>
+      </w:r>
+      <w:r>
+        <w:rPr>
+          <w:b/>
+          <w:bCs/>
+          <w:sz w:val="28"/>
+          <w:szCs w:val="28"/>
+        </w:rPr>
+        <w:t xml:space="preserve"> Doesn't know GitHub</w:t>
+      </w:r>
+    </w:p>
+    <w:p>
+      <w:pPr>
+        <w:jc w:val="both"/>
+        <w:rPr>
+          <w:b/>
+          <w:bCs/>
+          <w:sz w:val="28"/>
+          <w:szCs w:val="28"/>
+        </w:rPr>
+      </w:pPr>
+      <w:r>
+        <w:rPr>
+          <w:b/>
+          <w:bCs/>
+          <w:sz w:val="28"/>
+          <w:szCs w:val="28"/>
+        </w:rPr>
+        <w:t xml:space="preserve">   └── Only sees our files</w:t>
+      </w:r>
+    </w:p>
+    <w:p>
+      <w:pPr>
+        <w:jc w:val="both"/>
+        <w:rPr>
+          <w:sz w:val="32"/>
+          <w:szCs w:val="32"/>
+        </w:rPr>
+      </w:pPr>
+      <w:r>
+        <w:rPr>
+          <w:sz w:val="32"/>
+          <w:szCs w:val="32"/>
+        </w:rPr>
+        <w:t># After MCP. Instead of guessing, Codex can call tools exposed by those services. MCP is an open protocol for connecting AI assistants to external tools and data sources:</w:t>
+      </w:r>
+    </w:p>
+    <w:p>
+      <w:pPr>
+        <w:jc w:val="both"/>
+        <w:rPr>
+          <w:b/>
+          <w:bCs/>
+          <w:sz w:val="28"/>
+          <w:szCs w:val="28"/>
+        </w:rPr>
+      </w:pPr>
+      <w:r>
+        <w:rPr>
+          <w:b/>
+          <w:bCs/>
+          <w:sz w:val="28"/>
+          <w:szCs w:val="28"/>
+        </w:rPr>
+        <w:t xml:space="preserve">                                 MCP</w:t>
+      </w:r>
+    </w:p>
+    <w:p>
+      <w:pPr>
+        <w:jc w:val="both"/>
+        <w:rPr>
+          <w:b/>
+          <w:bCs/>
+          <w:sz w:val="28"/>
+          <w:szCs w:val="28"/>
+        </w:rPr>
+      </w:pPr>
+      <w:r>
+        <w:rPr>
+          <w:b/>
+          <w:bCs/>
+          <w:sz w:val="28"/>
+          <w:szCs w:val="28"/>
+        </w:rPr>
+        <w:t xml:space="preserve">                                     │</w:t>
+      </w:r>
+    </w:p>
+    <w:p>
+      <w:pPr>
+        <w:jc w:val="both"/>
+        <w:rPr>
+          <w:b/>
+          <w:bCs/>
+          <w:sz w:val="28"/>
+          <w:szCs w:val="28"/>
+        </w:rPr>
+      </w:pPr>
+      <w:r>
+        <w:rPr>
+          <w:b/>
+          <w:bCs/>
+          <w:sz w:val="28"/>
+          <w:szCs w:val="28"/>
+        </w:rPr>
+        <w:t xml:space="preserve">     ┌────────────</w:t>
+      </w:r>
+      <w:r>
+        <w:rPr>
+          <w:rFonts w:ascii="Arial" w:hAnsi="Arial" w:cs="Arial"/>
+          <w:b/>
+          <w:bCs/>
+          <w:sz w:val="28"/>
+          <w:szCs w:val="28"/>
+        </w:rPr>
+        <w:t>┼</w:t>
+      </w:r>
+      <w:r>
+        <w:rPr>
+          <w:rFonts w:ascii="Aptos" w:hAnsi="Aptos" w:cs="Aptos"/>
+          <w:b/>
+          <w:bCs/>
+          <w:sz w:val="28"/>
+          <w:szCs w:val="28"/>
+        </w:rPr>
+        <w:t>────────────┐</w:t>
+      </w:r>
+    </w:p>
+    <w:p>
+      <w:pPr>
+        <w:jc w:val="both"/>
+        <w:rPr>
+          <w:b/>
+          <w:bCs/>
+          <w:sz w:val="28"/>
+          <w:szCs w:val="28"/>
+        </w:rPr>
+      </w:pPr>
+      <w:r>
+        <w:rPr>
+          <w:b/>
+          <w:bCs/>
+          <w:sz w:val="28"/>
+          <w:szCs w:val="28"/>
+        </w:rPr>
+        <w:t xml:space="preserve">     │                              │                              │</w:t>
+      </w:r>
+    </w:p>
+    <w:p>
+      <w:pPr>
+        <w:jc w:val="both"/>
+        <w:rPr>
+          <w:b/>
+          <w:bCs/>
+          <w:sz w:val="28"/>
+          <w:szCs w:val="28"/>
+        </w:rPr>
+      </w:pPr>
+      <w:r>
+        <w:rPr>
+          <w:b/>
+          <w:bCs/>
+          <w:sz w:val="28"/>
+          <w:szCs w:val="28"/>
+        </w:rPr>
+        <w:t>Flutter SDK    Firebase             GitHub</w:t>
+      </w:r>
+    </w:p>
+    <w:p>
+      <w:pPr>
+        <w:jc w:val="both"/>
+        <w:rPr>
+          <w:b/>
+          <w:bCs/>
+          <w:sz w:val="28"/>
+          <w:szCs w:val="28"/>
+        </w:rPr>
+      </w:pPr>
+      <w:r>
+        <w:rPr>
+          <w:b/>
+          <w:bCs/>
+          <w:sz w:val="28"/>
+          <w:szCs w:val="28"/>
+        </w:rPr>
+        <w:t xml:space="preserve">     │                              │                              │</w:t>
+      </w:r>
+    </w:p>
+    <w:p>
+      <w:pPr>
+        <w:jc w:val="both"/>
+        <w:rPr>
+          <w:b/>
+          <w:bCs/>
+          <w:sz w:val="28"/>
+          <w:szCs w:val="28"/>
+        </w:rPr>
+      </w:pPr>
+      <w:r>
+        <w:rPr>
+          <w:b/>
+          <w:bCs/>
+          <w:sz w:val="28"/>
+          <w:szCs w:val="28"/>
+        </w:rPr>
+        <w:t xml:space="preserve">     └────────────</w:t>
+      </w:r>
+      <w:r>
+        <w:rPr>
+          <w:rFonts w:ascii="Arial" w:hAnsi="Arial" w:cs="Arial"/>
+          <w:b/>
+          <w:bCs/>
+          <w:sz w:val="28"/>
+          <w:szCs w:val="28"/>
+        </w:rPr>
+        <w:t>┼</w:t>
+      </w:r>
+      <w:r>
+        <w:rPr>
+          <w:rFonts w:ascii="Aptos" w:hAnsi="Aptos" w:cs="Aptos"/>
+          <w:b/>
+          <w:bCs/>
+          <w:sz w:val="28"/>
+          <w:szCs w:val="28"/>
+        </w:rPr>
+        <w:t>────────────┘</w:t>
+      </w:r>
+    </w:p>
+    <w:p>
+      <w:pPr>
+        <w:jc w:val="both"/>
+        <w:rPr>
+          <w:b/>
+          <w:bCs/>
+          <w:sz w:val="28"/>
+          <w:szCs w:val="28"/>
+        </w:rPr>
+      </w:pPr>
+      <w:r>
+        <w:rPr>
+          <w:b/>
+          <w:bCs/>
+          <w:sz w:val="28"/>
+          <w:szCs w:val="28"/>
+        </w:rPr>
+        <w:t xml:space="preserve">                                     │</w:t>
+      </w:r>
+    </w:p>
+    <w:p>
+      <w:pPr>
+        <w:jc w:val="both"/>
+        <w:rPr>
+          <w:b/>
+          <w:bCs/>
+          <w:sz w:val="28"/>
+          <w:szCs w:val="28"/>
+        </w:rPr>
+      </w:pPr>
+      <w:r>
+        <w:rPr>
+          <w:b/>
+          <w:bCs/>
+          <w:sz w:val="28"/>
+          <w:szCs w:val="28"/>
+        </w:rPr>
+        <w:t xml:space="preserve">                               Codex</w:t>
+      </w:r>
+    </w:p>
+    <w:p>
+      <w:pPr>
+        <w:jc w:val="both"/>
+        <w:rPr>
+          <w:sz w:val="32"/>
+          <w:szCs w:val="32"/>
+        </w:rPr>
+      </w:pPr>
+      <w:r>
+        <w:rPr>
+          <w:sz w:val="32"/>
+          <w:szCs w:val="32"/>
+        </w:rPr>
+        <w:t># MCP Isn't Magic. Many developers misunderstand MCP.</w:t>
+      </w:r>
+    </w:p>
+    <w:p>
+      <w:pPr>
+        <w:jc w:val="both"/>
+        <w:rPr>
+          <w:sz w:val="32"/>
+          <w:szCs w:val="32"/>
+        </w:rPr>
+      </w:pPr>
+      <w:r>
+        <w:rPr>
+          <w:sz w:val="32"/>
+          <w:szCs w:val="32"/>
+        </w:rPr>
+        <w:t># MCP does not make the AI smarter. Instead, it gives the AI new capabilities. Without MCP:</w:t>
+      </w:r>
+    </w:p>
+    <w:p>
+      <w:pPr>
+        <w:jc w:val="both"/>
+        <w:rPr>
+          <w:b/>
+          <w:bCs/>
+          <w:sz w:val="32"/>
+          <w:szCs w:val="32"/>
+        </w:rPr>
+      </w:pPr>
+      <w:r>
+        <w:rPr>
+          <w:b/>
+          <w:bCs/>
+          <w:sz w:val="32"/>
+          <w:szCs w:val="32"/>
+        </w:rPr>
+        <w:t>"I think this API exists..."</w:t>
+      </w:r>
+    </w:p>
+    <w:p>
+      <w:pPr>
+        <w:jc w:val="both"/>
+        <w:rPr>
+          <w:sz w:val="32"/>
+          <w:szCs w:val="32"/>
+        </w:rPr>
+      </w:pPr>
+      <w:r>
+        <w:rPr>
+          <w:sz w:val="32"/>
+          <w:szCs w:val="32"/>
+        </w:rPr>
+        <w:lastRenderedPageBreak/>
+        <w:t># With MCP:</w:t>
+      </w:r>
+    </w:p>
+    <w:p>
+      <w:pPr>
+        <w:jc w:val="both"/>
+        <w:rPr>
+          <w:sz w:val="32"/>
+          <w:szCs w:val="32"/>
+        </w:rPr>
+      </w:pPr>
+      <w:r>
+        <w:rPr>
+          <w:b/>
+          <w:bCs/>
+          <w:sz w:val="32"/>
+          <w:szCs w:val="32"/>
+        </w:rPr>
+        <w:t>"I'll ask the Dart analyzer."</w:t>
+      </w:r>
+    </w:p>
+    <w:p>
+      <w:pPr>
+        <w:jc w:val="both"/>
+        <w:rPr>
+          <w:sz w:val="32"/>
+          <w:szCs w:val="32"/>
+        </w:rPr>
+      </w:pPr>
+    </w:p>
+    <w:p>
+      <w:pPr>
+        <w:jc w:val="center"/>
+        <w:rPr>
+          <w:sz w:val="32"/>
+          <w:szCs w:val="32"/>
+        </w:rPr>
+      </w:pPr>
+      <w:r>
+        <w:rPr>
+          <w:sz w:val="32"/>
+          <w:szCs w:val="32"/>
+        </w:rPr>
+        <w:t>Break</w:t>
+      </w:r>
+    </w:p>
+    <w:p>
+      <w:pPr>
+        <w:jc w:val="both"/>
+        <w:rPr>
+          <w:sz w:val="32"/>
+          <w:szCs w:val="32"/>
+        </w:rPr>
+      </w:pPr>
+    </w:p>
+    <w:p>
+      <w:pPr>
+        <w:jc w:val="both"/>
+        <w:rPr>
+          <w:b/>
+          <w:bCs/>
+          <w:sz w:val="32"/>
+          <w:szCs w:val="32"/>
+        </w:rPr>
+      </w:pPr>
+      <w:r>
+        <w:rPr>
+          <w:b/>
+          <w:bCs/>
+          <w:sz w:val="32"/>
+          <w:szCs w:val="32"/>
+        </w:rPr>
+        <w:t>AGENTS.md:</w:t>
+      </w:r>
+    </w:p>
+    <w:p>
+      <w:pPr>
+        <w:jc w:val="both"/>
+        <w:rPr>
+          <w:sz w:val="32"/>
+          <w:szCs w:val="32"/>
+        </w:rPr>
+      </w:pPr>
+      <w:r>
+        <w:rPr>
+          <w:sz w:val="32"/>
+          <w:szCs w:val="32"/>
+        </w:rPr>
+        <w:t xml:space="preserve"># </w:t>
+      </w:r>
     </w:p>
     <w:p>
       <w:pPr>
@@ -159,6 +776,104 @@
     </w:sectPr>
   </w:body>
 </w:document>
+</file>
+
+<file path=word/numbering.xml><?xml version="1.0" encoding="utf-8"?>
+<w:numbering xmlns:wpc="http://schemas.microsoft.com/office/word/2010/wordprocessingCanvas" xmlns:cx="http://schemas.microsoft.com/office/drawing/2014/chartex" xmlns:cx1="http://schemas.microsoft.com/office/drawing/2015/9/8/chartex" xmlns:cx2="http://schemas.microsoft.com/office/drawing/2015/10/21/chartex" xmlns:cx3="http://schemas.microsoft.com/office/drawing/2016/5/9/chartex" xmlns:cx4="http://schemas.microsoft.com/office/drawing/2016/5/10/chartex" xmlns:cx5="http://schemas.microsoft.com/office/drawing/2016/5/11/chartex" xmlns:cx6="http://schemas.microsoft.com/office/drawing/2016/5/12/chartex" xmlns:cx7="http://schemas.microsoft.com/office/drawing/2016/5/13/chartex" xmlns:cx8="http://schemas.microsoft.com/office/drawing/2016/5/14/chartex" xmlns:mc="http://schemas.openxmlformats.org/markup-compatibility/2006" xmlns:aink="http://schemas.microsoft.com/office/drawing/2016/ink" xmlns:am3d="http://schemas.microsoft.com/office/drawing/2017/model3d" xmlns:o="urn:schemas-microsoft-com:office:office" xmlns:oel="http://schemas.microsoft.com/office/2019/extlst" xmlns:r="http://schemas.openxmlformats.org/officeDocument/2006/relationships" xmlns:m="http://schemas.openxmlformats.org/officeDocument/2006/math" xmlns:v="urn:schemas-microsoft-com:vml" xmlns:wp14="http://schemas.microsoft.com/office/word/2010/wordprocessingDrawing" xmlns:wp="http://schemas.openxmlformats.org/drawingml/2006/wordprocessingDrawing" xmlns:w10="urn:schemas-microsoft-com:office:word" xmlns:w="http://schemas.openxmlformats.org/wordprocessingml/2006/main" xmlns:w14="http://schemas.microsoft.com/office/word/2010/wordml" xmlns:w15="http://schemas.microsoft.com/office/word/2012/wordml" xmlns:w16cex="http://schemas.microsoft.com/office/word/2018/wordml/cex" xmlns:w16cid="http://schemas.microsoft.com/office/word/2016/wordml/cid" xmlns:w16="http://schemas.microsoft.com/office/word/2018/wordml" xmlns:w16sdtdh="http://schemas.microsoft.com/office/word/2020/wordml/sdtdatahash" xmlns:w16se="http://schemas.microsoft.com/office/word/2015/wordml/symex" xmlns:wpg="http://schemas.microsoft.com/office/word/2010/wordprocessingGroup" xmlns:wpi="http://schemas.microsoft.com/office/word/2010/wordprocessingInk" xmlns:wne="http://schemas.microsoft.com/office/word/2006/wordml" xmlns:wps="http://schemas.microsoft.com/office/word/2010/wordprocessingShape" mc:Ignorable="w14 w15 w16se w16cid w16 w16cex w16sdtdh wp14">
+  <w:abstractNum w:abstractNumId="0" w15:restartNumberingAfterBreak="0">
+    <w:nsid w:val="67AB61BA"/>
+    <w:multiLevelType w:val="hybridMultilevel"/>
+    <w:tmpl w:val="DE5C0E54"/>
+    <w:lvl w:ilvl="0" w:tplc="27F66118">
+      <w:start w:val="1"/>
+      <w:numFmt w:val="decimal"/>
+      <w:lvlText w:val="%1."/>
+      <w:lvlJc w:val="left"/>
+      <w:pPr>
+        <w:ind w:left="360" w:hanging="360"/>
+      </w:pPr>
+      <w:rPr>
+        <w:b/>
+        <w:bCs/>
+      </w:rPr>
+    </w:lvl>
+    <w:lvl w:ilvl="1" w:tplc="04090019" w:tentative="1">
+      <w:start w:val="1"/>
+      <w:numFmt w:val="lowerLetter"/>
+      <w:lvlText w:val="%2."/>
+      <w:lvlJc w:val="left"/>
+      <w:pPr>
+        <w:ind w:left="1080" w:hanging="360"/>
+      </w:pPr>
+    </w:lvl>
+    <w:lvl w:ilvl="2" w:tplc="0409001B" w:tentative="1">
+      <w:start w:val="1"/>
+      <w:numFmt w:val="lowerRoman"/>
+      <w:lvlText w:val="%3."/>
+      <w:lvlJc w:val="right"/>
+      <w:pPr>
+        <w:ind w:left="1800" w:hanging="180"/>
+      </w:pPr>
+    </w:lvl>
+    <w:lvl w:ilvl="3" w:tplc="0409000F" w:tentative="1">
+      <w:start w:val="1"/>
+      <w:numFmt w:val="decimal"/>
+      <w:lvlText w:val="%4."/>
+      <w:lvlJc w:val="left"/>
+      <w:pPr>
+        <w:ind w:left="2520" w:hanging="360"/>
+      </w:pPr>
+    </w:lvl>
+    <w:lvl w:ilvl="4" w:tplc="04090019" w:tentative="1">
+      <w:start w:val="1"/>
+      <w:numFmt w:val="lowerLetter"/>
+      <w:lvlText w:val="%5."/>
+      <w:lvlJc w:val="left"/>
+      <w:pPr>
+        <w:ind w:left="3240" w:hanging="360"/>
+      </w:pPr>
+    </w:lvl>
+    <w:lvl w:ilvl="5" w:tplc="0409001B" w:tentative="1">
+      <w:start w:val="1"/>
+      <w:numFmt w:val="lowerRoman"/>
+      <w:lvlText w:val="%6."/>
+      <w:lvlJc w:val="right"/>
+      <w:pPr>
+        <w:ind w:left="3960" w:hanging="180"/>
+      </w:pPr>
+    </w:lvl>
+    <w:lvl w:ilvl="6" w:tplc="0409000F" w:tentative="1">
+      <w:start w:val="1"/>
+      <w:numFmt w:val="decimal"/>
+      <w:lvlText w:val="%7."/>
+      <w:lvlJc w:val="left"/>
+      <w:pPr>
+        <w:ind w:left="4680" w:hanging="360"/>
+      </w:pPr>
+    </w:lvl>
+    <w:lvl w:ilvl="7" w:tplc="04090019" w:tentative="1">
+      <w:start w:val="1"/>
+      <w:numFmt w:val="lowerLetter"/>
+      <w:lvlText w:val="%8."/>
+      <w:lvlJc w:val="left"/>
+      <w:pPr>
+        <w:ind w:left="5400" w:hanging="360"/>
+      </w:pPr>
+    </w:lvl>
+    <w:lvl w:ilvl="8" w:tplc="0409001B" w:tentative="1">
+      <w:start w:val="1"/>
+      <w:numFmt w:val="lowerRoman"/>
+      <w:lvlText w:val="%9."/>
+      <w:lvlJc w:val="right"/>
+      <w:pPr>
+        <w:ind w:left="6120" w:hanging="180"/>
+      </w:pPr>
+    </w:lvl>
+  </w:abstractNum>
+  <w:num w:numId="1" w16cid:durableId="296448190">
+    <w:abstractNumId w:val="0"/>
+  </w:num>
+</w:numbering>
 </file>
 
 <file path=word/styles.xml><?xml version="1.0" encoding="utf-8"?>

</xml_diff>